<commit_message>
Add client city to intake form
</commit_message>
<xml_diff>
--- a/ClientIntakeForm_Automation_Template.docx
+++ b/ClientIntakeForm_Automation_Template.docx
@@ -208,6 +208,38 @@
                 <w:sz w:val="18"/>
               </w:rPr>
               <w:t>{{clientAddress}}</w:t>
+            </w:r>
+          </w:p>
+        </w:tc>
+      </w:tr>
+      <w:tr>
+        <w:tc>
+          <w:tcPr>
+            <w:tcW w:type="dxa" w:w="5328"/>
+          </w:tcPr>
+          <w:p>
+            <w:r/>
+            <w:r>
+              <w:rPr>
+                <w:b/>
+                <w:sz w:val="18"/>
+              </w:rPr>
+              <w:t>City *</w:t>
+            </w:r>
+          </w:p>
+        </w:tc>
+        <w:tc>
+          <w:tcPr>
+            <w:tcW w:type="dxa" w:w="5328"/>
+          </w:tcPr>
+          <w:p>
+            <w:r/>
+            <w:r>
+              <w:rPr>
+                <w:b w:val="0"/>
+                <w:sz w:val="18"/>
+              </w:rPr>
+              <w:t>{{clientCity}}</w:t>
             </w:r>
           </w:p>
         </w:tc>

</xml_diff>